<commit_message>
Added images per location. Changed pointer functionality. Made scrolling smoother. Changed how planned trips are displayed. Minor bug fixes.
</commit_message>
<xml_diff>
--- a/docs/GlobeTrek-Learning-Journal.docx
+++ b/docs/GlobeTrek-Learning-Journal.docx
@@ -7,6 +7,10 @@
         <w:pStyle w:val="Title"/>
       </w:pPr>
       <w:r>
+        <w:rPr>
+          <w:color w:val="000000"/>
+          <w:u w:val="none"/>
+        </w:rPr>
         <w:t>GlobeTrek Learning Journal</w:t>
       </w:r>
     </w:p>
@@ -32,6 +36,11 @@
       </w:r>
     </w:p>
     <w:p>
+      <w:r>
+        <w:t>The hotel foundation sections record the earlier learning build. The travel planner sections later in this journal supersede its old 14-night, 90-day and INR-only limits and earlier frontend file locations. Current trips use 1 to 30 days within a 365-day horizon, with explicit destination currencies and server-priced multi-item reservations.</w:t>
+      </w:r>
+    </w:p>
+    <w:p>
       <w:pPr>
         <w:pStyle w:val="Heading1"/>
       </w:pPr>
@@ -396,6 +405,10 @@
         <w:pStyle w:val="Title"/>
       </w:pPr>
       <w:r>
+        <w:rPr>
+          <w:color w:val="000000"/>
+          <w:u w:val="none"/>
+        </w:rPr>
         <w:t>GlobeTrek Interview Practice</w:t>
       </w:r>
     </w:p>
@@ -863,6 +876,1022 @@
     <w:p>
       <w:r>
         <w:t>Capacity filtering is catalog discovery, not a reservation or availability check. It leaves all embedded room types in the hotel response. Catalog minPrice remains the lowest price across all room types, which might belong to a smaller room; a chosen room's authoritative price comes from the availability/booking service. No new schema, index, external service, commit, or deployment was required. A running Node demo must restart to load these backend edits, unlike a browser-only view update.</w:t>
+      </w:r>
+    </w:p>
+    <w:p>
+      <w:r>
+        <w:br w:type="page"/>
+      </w:r>
+    </w:p>
+    <w:p>
+      <w:pPr>
+        <w:pStyle w:val="Heading1"/>
+      </w:pPr>
+      <w:r>
+        <w:t>GlobeTrek travel planner learning notes</w:t>
+      </w:r>
+    </w:p>
+    <w:p>
+      <w:pPr>
+        <w:widowControl/>
+        <w:spacing w:after="160"/>
+      </w:pPr>
+      <w:r>
+        <w:rPr>
+          <w:color w:val="000000"/>
+        </w:rPr>
+        <w:t>These notes extend the hotel foundation. The implementation has been written by AI and must still be walked through with the learner; passing tests does not certify personal understanding.</w:t>
+      </w:r>
+    </w:p>
+    <w:p>
+      <w:pPr>
+        <w:pStyle w:val="Heading2"/>
+      </w:pPr>
+      <w:r>
+        <w:t>Modeling a travel domain</w:t>
+      </w:r>
+    </w:p>
+    <w:p>
+      <w:pPr>
+        <w:widowControl/>
+        <w:spacing w:after="160"/>
+      </w:pPr>
+      <w:r>
+        <w:rPr>
+          <w:color w:val="000000"/>
+        </w:rPr>
+        <w:t>What: distinguish an attraction, tour product, scheduled departure, template, fixed package, trip draft and reservation snapshot. Why: confusing these would allow editing a confirmed purchase or create duplicate stock. Where: server/src/models/travel.js and CONTEXT.md. Verification: exact catalog-count and package/shared-inventory tests. Interview explanation: products describe an experience; departures hold timed capacity; drafts are editable; bookings preserve what was accepted.</w:t>
+      </w:r>
+    </w:p>
+    <w:p>
+      <w:pPr>
+        <w:pStyle w:val="Heading2"/>
+      </w:pPr>
+      <w:r>
+        <w:t>Mixed inventory transactions</w:t>
+      </w:r>
+    </w:p>
+    <w:p>
+      <w:pPr>
+        <w:widowControl/>
+        <w:spacing w:after="160"/>
+      </w:pPr>
+      <w:r>
+        <w:rPr>
+          <w:color w:val="000000"/>
+        </w:rPr>
+        <w:t>What: collect per-night room demands, departure seats and package capacity into a Map, aggregate by resource key, sort and conditionally increment held quantities in one transaction. Why: one unavailable item must roll back earlier increments. Where: services/reservations.js. Verification: last-room contention, package-versus-tour stock, mixed rollback and direct database assertions. Interview explanation: a transaction gives all-or-nothing behavior; conditional predicates enforce capacity; unique indexes protect identity and active-hold invariants.</w:t>
+      </w:r>
+    </w:p>
+    <w:p>
+      <w:pPr>
+        <w:pStyle w:val="Heading2"/>
+      </w:pPr>
+      <w:r>
+        <w:t>Quotes holds confirmation and expiry</w:t>
+      </w:r>
+    </w:p>
+    <w:p>
+      <w:pPr>
+        <w:widowControl/>
+        <w:spacing w:after="160"/>
+      </w:pPr>
+      <w:r>
+        <w:rPr>
+          <w:color w:val="000000"/>
+        </w:rPr>
+        <w:t>What: quotes freeze a price temporarily; holds reserve capacity temporarily; confirmation changes held into booked. Why: a displayed price or quote is not a reservation. Where: createQuote, hold, transition and reconciliation. Verification: late confirmation without cleanup, duplicate sweepers, repeated confirmation/cancellation and expiry races. Interview explanation: persisted deadlines determine correctness; timers improve cleanup promptness. TTL deletion is not a business workflow and cannot release counters transactionally.</w:t>
+      </w:r>
+    </w:p>
+    <w:p>
+      <w:pPr>
+        <w:pStyle w:val="Heading2"/>
+      </w:pPr>
+      <w:r>
+        <w:t>Dates timezones and currency</w:t>
+      </w:r>
+    </w:p>
+    <w:p>
+      <w:pPr>
+        <w:widowControl/>
+        <w:spacing w:after="160"/>
+      </w:pPr>
+      <w:r>
+        <w:rPr>
+          <w:color w:val="000000"/>
+        </w:rPr>
+        <w:t>What: civil dates label trip days and hotel nights; UTC instants identify scheduled tour starts. Currency amounts have explicit minor-unit precision. Why: browser timezone and universal division by 100 would corrupt dates or Japanese yen. Where: shared/travel.js and travel-policy.js. Verification: DST gaps/ambiguities, exclusive checkout, fee rounding and EUR-based conversion direction. Interview explanation: preserve the business meaning of a value instead of treating every date as an instant or every amount as a floating number.</w:t>
+      </w:r>
+    </w:p>
+    <w:p>
+      <w:pPr>
+        <w:pStyle w:val="Heading2"/>
+      </w:pPr>
+      <w:r>
+        <w:t>Draft state and optimistic concurrency</w:t>
+      </w:r>
+    </w:p>
+    <w:p>
+      <w:pPr>
+        <w:widowControl/>
+        <w:spacing w:after="160"/>
+      </w:pPr>
+      <w:r>
+        <w:rPr>
+          <w:color w:val="000000"/>
+        </w:rPr>
+        <w:t>What: a reducer owns edits, local storage preserves guest intent and backup, server revisions reject stale autosaves. Why: multiple tabs can edit the same trip. Where: client planner and trip services. Verification: 409 stale-revision and cross-user tests plus browser guest/login/save journey. Interview explanation: each write states which version it saw; a mismatch requires user reconciliation rather than silent overwrite. Draft versions and reservation snapshots have different lifecycles.</w:t>
+      </w:r>
+    </w:p>
+    <w:p>
+      <w:pPr>
+        <w:pStyle w:val="Heading2"/>
+      </w:pPr>
+      <w:r>
+        <w:t>Geographic views and resilience</w:t>
+      </w:r>
+    </w:p>
+    <w:p>
+      <w:pPr>
+        <w:widowControl/>
+        <w:spacing w:after="160"/>
+      </w:pPr>
+      <w:r>
+        <w:rPr>
+          <w:color w:val="000000"/>
+        </w:rPr>
+        <w:t>What: lazy-loaded globe and map engines display the same catalog IDs used by accessible lists. Why: visual discovery should not require WebGL or working third-party tiles. Where: geo components, country explorer and planner. Verification: responsive browser checks, keyboard alternatives, map-error/list fallback. Interview explanation: geography is a view over domain state; it is not a second source of truth. Straight route lines do not establish navigability.</w:t>
+      </w:r>
+    </w:p>
+    <w:p>
+      <w:pPr>
+        <w:pStyle w:val="Heading2"/>
+      </w:pPr>
+      <w:r>
+        <w:t>Seed safety and content provenance</w:t>
+      </w:r>
+    </w:p>
+    <w:p>
+      <w:pPr>
+        <w:widowControl/>
+        <w:spacing w:after="160"/>
+      </w:pPr>
+      <w:r>
+        <w:rPr>
+          <w:color w:val="000000"/>
+        </w:rPr>
+        <w:t>What: stable keys preserve resource identities; insert-only capacity generation tracks a horizon; licensed photos retain author/source/license. Why: resetting counts or recreating missing historical rows could oversell. Where: seed/travel.js and destination attribution manifest. Verification: rerun with booked rows and deliberate inventory holes. Interview explanation: seed scripts are production data operations, not harmless fixtures; idempotency must preserve business history.</w:t>
+      </w:r>
+    </w:p>
+    <w:p>
+      <w:pPr>
+        <w:pStyle w:val="Heading2"/>
+      </w:pPr>
+      <w:r>
+        <w:t>Interview practice for the expanded project</w:t>
+      </w:r>
+    </w:p>
+    <w:p>
+      <w:pPr>
+        <w:widowControl/>
+        <w:spacing w:after="160"/>
+      </w:pPr>
+      <w:r>
+        <w:rPr>
+          <w:color w:val="000000"/>
+        </w:rPr>
+        <w:t>1. Why are tours and departures separate? Discuss product metadata versus a timed stock unit.</w:t>
+      </w:r>
+    </w:p>
+    <w:p>
+      <w:pPr>
+        <w:widowControl/>
+        <w:spacing w:after="160"/>
+      </w:pPr>
+      <w:r>
+        <w:rPr>
+          <w:color w:val="000000"/>
+        </w:rPr>
+        <w:t>2. How can a package and a standalone tour share the last seat? Explain common resource IDs, conditional writes, rollback and package capacity.</w:t>
+      </w:r>
+    </w:p>
+    <w:p>
+      <w:pPr>
+        <w:widowControl/>
+        <w:spacing w:after="160"/>
+      </w:pPr>
+      <w:r>
+        <w:rPr>
+          <w:color w:val="000000"/>
+        </w:rPr>
+        <w:t>3. What happens when confirmation races expiry? Walk through transactional status checks and exactly-once counter movement.</w:t>
+      </w:r>
+    </w:p>
+    <w:p>
+      <w:pPr>
+        <w:widowControl/>
+        <w:spacing w:after="160"/>
+      </w:pPr>
+      <w:r>
+        <w:rPr>
+          <w:color w:val="000000"/>
+        </w:rPr>
+        <w:t>4. Why do you retain idempotency keys after a network error? The server may have committed before the response disappeared.</w:t>
+      </w:r>
+    </w:p>
+    <w:p>
+      <w:pPr>
+        <w:widowControl/>
+        <w:spacing w:after="160"/>
+      </w:pPr>
+      <w:r>
+        <w:rPr>
+          <w:color w:val="000000"/>
+        </w:rPr>
+        <w:t>5. Why use a revision as well as a transaction? Revision detects stale user intent; transaction protects database consistency across resources.</w:t>
+      </w:r>
+    </w:p>
+    <w:p>
+      <w:pPr>
+        <w:widowControl/>
+        <w:spacing w:after="160"/>
+      </w:pPr>
+      <w:r>
+        <w:rPr>
+          <w:color w:val="000000"/>
+        </w:rPr>
+        <w:t>6. Can a map route guarantee a feasible day? No; transport, opening hours, entry and local access require separate checks.</w:t>
+      </w:r>
+    </w:p>
+    <w:p>
+      <w:pPr>
+        <w:widowControl/>
+        <w:spacing w:after="160"/>
+      </w:pPr>
+      <w:r>
+        <w:rPr>
+          <w:color w:val="000000"/>
+        </w:rPr>
+        <w:t>7. What does free sleeping hosting change? Cleanup latency and cold starts; persisted-deadline enforcement still prevents late confirmation.</w:t>
+      </w:r>
+    </w:p>
+    <w:p>
+      <w:pPr>
+        <w:widowControl/>
+        <w:spacing w:after="160"/>
+      </w:pPr>
+      <w:r>
+        <w:rPr>
+          <w:color w:val="000000"/>
+        </w:rPr>
+        <w:t>8. How do you distinguish your measurements from a scalability claim? Name environment, dataset, concurrency, duration, latency distributions, expected conflicts and database assertions.</w:t>
+      </w:r>
+    </w:p>
+    <w:p>
+      <w:pPr>
+        <w:widowControl/>
+        <w:spacing w:after="160"/>
+      </w:pPr>
+      <w:r>
+        <w:rPr>
+          <w:color w:val="000000"/>
+        </w:rPr>
+        <w:t>9. Where would you improve next? Supplier integration, destination editorial review, cancellation policy sophistication, jobs on an approved always-on worker and richer navigation data, only with explicit product decisions.</w:t>
+      </w:r>
+    </w:p>
+    <w:p>
+      <w:r>
+        <w:br w:type="page"/>
+      </w:r>
+    </w:p>
+    <w:p>
+      <w:pPr>
+        <w:pStyle w:val="Heading1"/>
+      </w:pPr>
+      <w:r>
+        <w:t>Release hardening and recovery</w:t>
+      </w:r>
+    </w:p>
+    <w:p>
+      <w:pPr>
+        <w:widowControl/>
+        <w:spacing w:after="160"/>
+      </w:pPr>
+      <w:r>
+        <w:rPr>
+          <w:color w:val="000000"/>
+        </w:rPr>
+        <w:t>The travel planner now has working end-to-end journeys and automated failure checks. These notes explain the important fixes; the learner still needs to walk through critical code and explain the decisions in their own words.</w:t>
+      </w:r>
+    </w:p>
+    <w:p>
+      <w:pPr>
+        <w:pStyle w:val="Heading2"/>
+      </w:pPr>
+      <w:r>
+        <w:t>Authentication and cached identities</w:t>
+      </w:r>
+    </w:p>
+    <w:p>
+      <w:pPr>
+        <w:widowControl/>
+        <w:spacing w:after="160"/>
+      </w:pPr>
+      <w:r>
+        <w:rPr>
+          <w:color w:val="000000"/>
+        </w:rPr>
+        <w:t>What: login cancels pending queries, removes other cached data and updates the existing observed session query. Why: clearing the entire cache first replaced the query observed by the authentication provider, so the planner could still appear signed out after successful registration. Where: client/src/auth.jsx. Tested: the browser creates a guest trip, registers, saves it and completes a reservation. Interview explanation: authentication success must update the client state that the interface actually observes; private caches must also be isolated between identities.</w:t>
+      </w:r>
+    </w:p>
+    <w:p>
+      <w:pPr>
+        <w:pStyle w:val="Heading2"/>
+      </w:pPr>
+      <w:r>
+        <w:t>Recoverable drafts and conflicting tabs</w:t>
+      </w:r>
+    </w:p>
+    <w:p>
+      <w:pPr>
+        <w:widowControl/>
+        <w:spacing w:after="160"/>
+      </w:pPr>
+      <w:r>
+        <w:rPr>
+          <w:color w:val="000000"/>
+        </w:rPr>
+        <w:t>What: local backups preserve edits through reload; saved trips use revision-checked autosaves and explicit restore/copy choices. Why: network failure is not proof of a successful save, and two tabs can edit the same document. Where: planner and trip services. Tested: aborted PATCH, reload, restore, retry, a separate tab's accepted update and saving conflicted edits as a new trip. Interview explanation: optimistic concurrency protects user intent while backups protect unsent edits; neither silently overwrites another version.</w:t>
+      </w:r>
+    </w:p>
+    <w:p>
+      <w:pPr>
+        <w:pStyle w:val="Heading2"/>
+      </w:pPr>
+      <w:r>
+        <w:t>Ambiguous reservation responses</w:t>
+      </w:r>
+    </w:p>
+    <w:p>
+      <w:pPr>
+        <w:widowControl/>
+        <w:spacing w:after="160"/>
+      </w:pPr>
+      <w:r>
+        <w:rPr>
+          <w:color w:val="000000"/>
+        </w:rPr>
+        <w:t>What: one key remains attached to the same quote after refresh or network failure. Why: the server may commit a hold before the response disappears. Where: reservation review and hold service. Tested: the browser lets the server complete the POST, discards its response, then retries and verifies only one reservation exists. Interview explanation: delivery and execution are different; safe retries require durable operation identity rather than a new request key.</w:t>
+      </w:r>
+    </w:p>
+    <w:p>
+      <w:pPr>
+        <w:pStyle w:val="Heading2"/>
+      </w:pPr>
+      <w:r>
+        <w:t>Time boundaries and transaction retries</w:t>
+      </w:r>
+    </w:p>
+    <w:p>
+      <w:pPr>
+        <w:widowControl/>
+        <w:spacing w:after="160"/>
+      </w:pPr>
+      <w:r>
+        <w:rPr>
+          <w:color w:val="000000"/>
+        </w:rPr>
+        <w:t>What: confirmation checks the persisted deadline on each retried transaction; cancellation closes at the earliest item start. Why: a driver retry can happen later than the initial HTTP request. Where: reservation transition service. Tested: exact expiry/cancellation boundaries, late confirmation without cleanup, repeated cancellation and racing sweepers. Interview explanation: the driver retries database work, so time-sensitive business predicates must remain valid on the retried attempt.</w:t>
+      </w:r>
+    </w:p>
+    <w:p>
+      <w:pPr>
+        <w:pStyle w:val="Heading2"/>
+      </w:pPr>
+      <w:r>
+        <w:t>Planning guidance and authority</w:t>
+      </w:r>
+    </w:p>
+    <w:p>
+      <w:pPr>
+        <w:widowControl/>
+        <w:spacing w:after="160"/>
+      </w:pPr>
+      <w:r>
+        <w:rPr>
+          <w:color w:val="000000"/>
+        </w:rPr>
+        <w:t>What: the UI explains unresolved departures, overlapping tours/stays, long visit days and multiple cities, and estimates selected stay/tour costs. Why: users should discover mistakes before checkout. The estimate uses whole rooms sufficient for the party and is explicitly informational; the authoritative quote is calculated again on the server. Where: client/src/planning.js and shared planner controls. Tested: scenario tests plus browser template/tour journeys. Interview explanation: client guidance improves usability; the server independently enforces availability, schedule, ownership and price invariants.</w:t>
+      </w:r>
+    </w:p>
+    <w:p>
+      <w:pPr>
+        <w:pStyle w:val="Heading2"/>
+      </w:pPr>
+      <w:r>
+        <w:t>External data failure and usage</w:t>
+      </w:r>
+    </w:p>
+    <w:p>
+      <w:pPr>
+        <w:widowControl/>
+        <w:spacing w:after="160"/>
+      </w:pPr>
+      <w:r>
+        <w:rPr>
+          <w:color w:val="000000"/>
+        </w:rPr>
+        <w:t>What: dated ECB snapshots support INR estimates, with single-flight refresh, six-hour caching and failure backoff capped at one hour. Why: an informational provider must not become a checkout dependency or an uncontrolled retry loop. Where: exchange-rate service and service register. Tested: malformed/partial XML, mocked provider failure, no immediate second fetch and successful native-currency quote creation without rates. Interview explanation: define authoritative data separately from enhancements and bound every external retry policy.</w:t>
+      </w:r>
+    </w:p>
+    <w:p>
+      <w:pPr>
+        <w:pStyle w:val="Heading2"/>
+      </w:pPr>
+      <w:r>
+        <w:t>Evidence and project claims</w:t>
+      </w:r>
+    </w:p>
+    <w:p>
+      <w:pPr>
+        <w:widowControl/>
+        <w:spacing w:after="160"/>
+      </w:pPr>
+      <w:r>
+        <w:rPr>
+          <w:color w:val="000000"/>
+        </w:rPr>
+        <w:t>What: isolated k6 profiles report latency distributions, throughput, expected conflicts and Node CPU/RSS, followed by direct database assertions. Why: a fast HTTP response alone does not establish correct inventory or hosted capacity. Where: load harness and performance report. Tested: room, tour and package/shared-stock races each produced exactly one winner among 20 requests. Interview explanation: state the environment and workload, distinguish expected sold-out outcomes from defects, and cite measured figures rather than extrapolated user counts.</w:t>
+      </w:r>
+    </w:p>
+    <w:p>
+      <w:pPr>
+        <w:pStyle w:val="Heading2"/>
+      </w:pPr>
+      <w:r>
+        <w:t>Expanded interview sheet</w:t>
+      </w:r>
+    </w:p>
+    <w:p>
+      <w:pPr>
+        <w:widowControl/>
+        <w:spacing w:after="160"/>
+      </w:pPr>
+      <w:r>
+        <w:rPr>
+          <w:color w:val="000000"/>
+        </w:rPr>
+        <w:t>1. Explain the complete globe-to-reservation flow, including which state is local, remote, cached or immutable.</w:t>
+      </w:r>
+    </w:p>
+    <w:p>
+      <w:pPr>
+        <w:widowControl/>
+        <w:spacing w:after="160"/>
+      </w:pPr>
+      <w:r>
+        <w:rPr>
+          <w:color w:val="000000"/>
+        </w:rPr>
+        <w:t>2. Why separate trip drafts, quotes, holds and confirmed snapshots? What changes can affect each?</w:t>
+      </w:r>
+    </w:p>
+    <w:p>
+      <w:pPr>
+        <w:widowControl/>
+        <w:spacing w:after="160"/>
+      </w:pPr>
+      <w:r>
+        <w:rPr>
+          <w:color w:val="000000"/>
+        </w:rPr>
+        <w:t>3. Which race does a unique index prevent, and which race needs a conditional inventory predicate?</w:t>
+      </w:r>
+    </w:p>
+    <w:p>
+      <w:pPr>
+        <w:widowControl/>
+        <w:spacing w:after="160"/>
+      </w:pPr>
+      <w:r>
+        <w:rPr>
+          <w:color w:val="000000"/>
+        </w:rPr>
+        <w:t>4. Why does a transaction not make every read trustworthy forever? Explain stale quotes and draft revisions.</w:t>
+      </w:r>
+    </w:p>
+    <w:p>
+      <w:pPr>
+        <w:widowControl/>
+        <w:spacing w:after="160"/>
+      </w:pPr>
+      <w:r>
+        <w:rPr>
+          <w:color w:val="000000"/>
+        </w:rPr>
+        <w:t>5. How does deleting a trip race with creating a hold, and why does the transaction write a trip fence?</w:t>
+      </w:r>
+    </w:p>
+    <w:p>
+      <w:pPr>
+        <w:widowControl/>
+        <w:spacing w:after="160"/>
+      </w:pPr>
+      <w:r>
+        <w:rPr>
+          <w:color w:val="000000"/>
+        </w:rPr>
+        <w:t>6. What happens if only the final item in a package is sold out? Point to rollback evidence.</w:t>
+      </w:r>
+    </w:p>
+    <w:p>
+      <w:pPr>
+        <w:widowControl/>
+        <w:spacing w:after="160"/>
+      </w:pPr>
+      <w:r>
+        <w:rPr>
+          <w:color w:val="000000"/>
+        </w:rPr>
+        <w:t>7. How would multiple server instances change the in-memory cache, rate limiter, expiry worker and observability choices?</w:t>
+      </w:r>
+    </w:p>
+    <w:p>
+      <w:pPr>
+        <w:widowControl/>
+        <w:spacing w:after="160"/>
+      </w:pPr>
+      <w:r>
+        <w:rPr>
+          <w:color w:val="000000"/>
+        </w:rPr>
+        <w:t>8. How do local calendar dates differ from tour instants at DST boundaries? Why is Japanese yen different from integer paise?</w:t>
+      </w:r>
+    </w:p>
+    <w:p>
+      <w:pPr>
+        <w:widowControl/>
+        <w:spacing w:after="160"/>
+      </w:pPr>
+      <w:r>
+        <w:rPr>
+          <w:color w:val="000000"/>
+        </w:rPr>
+        <w:t>9. What does a p99 latency describe? Why are 20-request contention percentiles not a long-running throughput benchmark?</w:t>
+      </w:r>
+    </w:p>
+    <w:p>
+      <w:pPr>
+        <w:widowControl/>
+        <w:spacing w:after="160"/>
+      </w:pPr>
+      <w:r>
+        <w:rPr>
+          <w:color w:val="000000"/>
+        </w:rPr>
+        <w:t>10. How are offline edits recovered without accepting silent last-write-wins behavior?</w:t>
+      </w:r>
+    </w:p>
+    <w:p>
+      <w:pPr>
+        <w:widowControl/>
+        <w:spacing w:after="160"/>
+      </w:pPr>
+      <w:r>
+        <w:rPr>
+          <w:color w:val="000000"/>
+        </w:rPr>
+        <w:t>11. Which provider calls does the application actually make, which files are self-hosted, and what happens when each provider fails?</w:t>
+      </w:r>
+    </w:p>
+    <w:p>
+      <w:pPr>
+        <w:widowControl/>
+        <w:spacing w:after="160"/>
+      </w:pPr>
+      <w:r>
+        <w:rPr>
+          <w:color w:val="000000"/>
+        </w:rPr>
+        <w:t>12. Which production concerns remain before taking real payments or customers? Discuss supplier contracts, policy, refunds, tax, monitoring, backups and hosting guarantees.</w:t>
+      </w:r>
+    </w:p>
+    <w:p>
+      <w:pPr>
+        <w:widowControl/>
+        <w:spacing w:after="160"/>
+      </w:pPr>
+      <w:r>
+        <w:rPr>
+          <w:color w:val="000000"/>
+        </w:rPr>
+        <w:t>Interviewers are likely to focus on ownership of the decisions, correctness under failure, security boundaries, concrete tests, measured claims and the ability to identify limitations. Use the code and evidence during rehearsal; do not claim independent authorship of AI-written modules you have not reviewed.</w:t>
+      </w:r>
+    </w:p>
+    <w:p>
+      <w:r>
+        <w:br w:type="page"/>
+      </w:r>
+    </w:p>
+    <w:p>
+      <w:pPr>
+        <w:pStyle w:val="Heading1"/>
+      </w:pPr>
+      <w:r>
+        <w:t>Connected maps and place previews</w:t>
+      </w:r>
+    </w:p>
+    <w:p>
+      <w:pPr>
+        <w:pStyle w:val="Heading2"/>
+      </w:pPr>
+      <w:r>
+        <w:t>One selection, several representations</w:t>
+      </w:r>
+    </w:p>
+    <w:p>
+      <w:pPr>
+        <w:widowControl/>
+        <w:spacing w:after="160"/>
+      </w:pPr>
+      <w:r>
+        <w:rPr>
+          <w:color w:val="000000"/>
+        </w:rPr>
+        <w:t>What: the page owns selection and passes it to the list, map and preview. Why: separate selection state in each component drifts out of sync. Where: discovery.jsx, planner.jsx and geo/Map.jsx. Verification: map presentation tests check identity and grouping; browser checks exercise both directions of selection. Interview explanation: shared state is lifted to the nearest common owner; showing information does not mutate the saved trip.</w:t>
+      </w:r>
+    </w:p>
+    <w:p>
+      <w:pPr>
+        <w:pStyle w:val="Heading2"/>
+      </w:pPr>
+      <w:r>
+        <w:t>Place identity versus stop identity</w:t>
+      </w:r>
+    </w:p>
+    <w:p>
+      <w:pPr>
+        <w:widowControl/>
+        <w:spacing w:after="160"/>
+      </w:pPr>
+      <w:r>
+        <w:rPr>
+          <w:color w:val="000000"/>
+        </w:rPr>
+        <w:t>What: a place identifies a destination; a stop occurrence identifies one visit on one trip day. Why: the same attraction may appear on two days, so a place ID alone cannot identify the selected planner row. Where: geo/presentation.js tripPoints and markerId. Verification: a regression test selects two different occurrence IDs for the same place. Interview explanation: choose keys according to the entity represented, not whichever ID is easiest to access.</w:t>
+      </w:r>
+    </w:p>
+    <w:p>
+      <w:pPr>
+        <w:pStyle w:val="Heading2"/>
+      </w:pPr>
+      <w:r>
+        <w:t>Routes, days and accessible colours</w:t>
+      </w:r>
+    </w:p>
+    <w:p>
+      <w:pPr>
+        <w:widowControl/>
+        <w:spacing w:after="160"/>
+      </w:pPr>
+      <w:r>
+        <w:rPr>
+          <w:color w:val="000000"/>
+        </w:rPr>
+        <w:t>What: route features are grouped by day, with stable day colours and explicit day/stop numbers. Why: flattening all stops into one line invents a connection between days; colour alone excludes people who cannot distinguish it. Where: routeFeatures and dayColor. Verification: tests assert separate route coordinates and thirty distinct stable day colours. Interview explanation: presentation must preserve the domain's grouping, and semantic labels provide information independently of colour.</w:t>
+      </w:r>
+    </w:p>
+    <w:p>
+      <w:pPr>
+        <w:pStyle w:val="Heading2"/>
+      </w:pPr>
+      <w:r>
+        <w:t>Scroll and map ownership</w:t>
+      </w:r>
+    </w:p>
+    <w:p>
+      <w:pPr>
+        <w:widowControl/>
+        <w:spacing w:after="160"/>
+      </w:pPr>
+      <w:r>
+        <w:rPr>
+          <w:color w:val="000000"/>
+        </w:rPr>
+        <w:t>What: desktop lists scroll within their own bounded panels; mobile lists use normal page scrolling. Deliberate reveals and pans respect reduced motion. Why: scrolling the entire page to synchronize a desktop row disorients the user, while wheel interception makes ordinary browsing harder. Where: revealInContainer, shared map and travel.css. Verification: browser interaction checks cover view switches and mobile list reveal. Interview explanation: identify the actual scroll owner before moving content, and reserve animation for actions that explain a state change.</w:t>
+      </w:r>
+    </w:p>
+    <w:p>
+      <w:pPr>
+        <w:pStyle w:val="Heading2"/>
+      </w:pPr>
+      <w:r>
+        <w:t>Geographic overlap and layout changes</w:t>
+      </w:r>
+    </w:p>
+    <w:p>
+      <w:pPr>
+        <w:widowControl/>
+        <w:spacing w:after="160"/>
+      </w:pPr>
+      <w:r>
+        <w:rPr>
+          <w:color w:val="000000"/>
+        </w:rPr>
+        <w:t>What: nearby markers offer a list of their underlying places or day occurrences. ResizeObserver resizes the map when its container changes. Why: overlapping buttons can hide valid destinations, and a map's canvas dimensions do not automatically describe a newly visible layout. Where: geo/Map.jsx. Verification: a browser check caught covered markers and the implementation was corrected to provide grouped choices. Interview explanation: a successful render is insufficient; every underlying record still needs an operable path.</w:t>
+      </w:r>
+    </w:p>
+    <w:p>
+      <w:pPr>
+        <w:pStyle w:val="Heading2"/>
+      </w:pPr>
+      <w:r>
+        <w:t>Build-time media and provenance</w:t>
+      </w:r>
+    </w:p>
+    <w:p>
+      <w:pPr>
+        <w:widowControl/>
+        <w:spacing w:after="160"/>
+      </w:pPr>
+      <w:r>
+        <w:rPr>
+          <w:color w:val="000000"/>
+        </w:rPr>
+        <w:t>What: photographs are imported once, reviewed, resized and served locally with author, source and license metadata. Why: runtime image search is unpredictable, adds provider requests and can show the wrong subject. Where: import-place-images.mjs, prepare-place-images.py and the versioned media manifest. Verification: contact-sheet subject review and catalog assertions validate coverage, attribution and files. Interview explanation: content quality is part of correctness; an automatically retrieved image is a candidate, not proof of a match.</w:t>
+      </w:r>
+    </w:p>
+    <w:p>
+      <w:pPr>
+        <w:pStyle w:val="Heading2"/>
+      </w:pPr>
+      <w:r>
+        <w:t>Non-modal previews and mobile sheets</w:t>
+      </w:r>
+    </w:p>
+    <w:p>
+      <w:pPr>
+        <w:widowControl/>
+        <w:spacing w:after="160"/>
+      </w:pPr>
+      <w:r>
+        <w:rPr>
+          <w:color w:val="000000"/>
+        </w:rPr>
+        <w:t>What: desktop previews allow continued map use; mobile sheets use the existing accessible dialog primitive. Why: mobile needs room for photographs and actions while desktop can retain context. Where: place-ui.jsx and ui.jsx. Verification: browser checks exercise Escape, focus restoration, preview actions and draft persistence. Interview explanation: the same content can use different presentation containers while sharing its data and behavior contract.</w:t>
+      </w:r>
+    </w:p>
+    <w:p>
+      <w:pPr>
+        <w:pStyle w:val="Heading2"/>
+      </w:pPr>
+      <w:r>
+        <w:t>Interview questions</w:t>
+      </w:r>
+    </w:p>
+    <w:p>
+      <w:pPr>
+        <w:widowControl/>
+        <w:spacing w:after="160"/>
+      </w:pPr>
+      <w:r>
+        <w:rPr>
+          <w:color w:val="000000"/>
+        </w:rPr>
+        <w:t>1. Why does a repeated attraction need a different planner key on each day?</w:t>
+      </w:r>
+    </w:p>
+    <w:p>
+      <w:pPr>
+        <w:widowControl/>
+        <w:spacing w:after="160"/>
+      </w:pPr>
+      <w:r>
+        <w:rPr>
+          <w:color w:val="000000"/>
+        </w:rPr>
+        <w:t>2. How would separate map and list selection state become inconsistent?</w:t>
+      </w:r>
+    </w:p>
+    <w:p>
+      <w:pPr>
+        <w:widowControl/>
+        <w:spacing w:after="160"/>
+      </w:pPr>
+      <w:r>
+        <w:rPr>
+          <w:color w:val="000000"/>
+        </w:rPr>
+        <w:t>3. Why must a route be grouped by day before generating GeoJSON?</w:t>
+      </w:r>
+    </w:p>
+    <w:p>
+      <w:pPr>
+        <w:widowControl/>
+        <w:spacing w:after="160"/>
+      </w:pPr>
+      <w:r>
+        <w:rPr>
+          <w:color w:val="000000"/>
+        </w:rPr>
+        <w:t>4. How do you keep nearby markers accessible without inventing different coordinates?</w:t>
+      </w:r>
+    </w:p>
+    <w:p>
+      <w:pPr>
+        <w:widowControl/>
+        <w:spacing w:after="160"/>
+      </w:pPr>
+      <w:r>
+        <w:rPr>
+          <w:color w:val="000000"/>
+        </w:rPr>
+        <w:t>5. Why does a hidden map need resizing when its layout becomes visible?</w:t>
+      </w:r>
+    </w:p>
+    <w:p>
+      <w:pPr>
+        <w:widowControl/>
+        <w:spacing w:after="160"/>
+      </w:pPr>
+      <w:r>
+        <w:rPr>
+          <w:color w:val="000000"/>
+        </w:rPr>
+        <w:t>6. When should smooth scrolling be disabled, and which element should scroll?</w:t>
+      </w:r>
+    </w:p>
+    <w:p>
+      <w:pPr>
+        <w:widowControl/>
+        <w:spacing w:after="160"/>
+      </w:pPr>
+      <w:r>
+        <w:rPr>
+          <w:color w:val="000000"/>
+        </w:rPr>
+        <w:t>7. Why import photographs at build time instead of searching on every page load?</w:t>
+      </w:r>
+    </w:p>
+    <w:p>
+      <w:pPr>
+        <w:widowControl/>
+        <w:spacing w:after="160"/>
+      </w:pPr>
+      <w:r>
+        <w:rPr>
+          <w:color w:val="000000"/>
+        </w:rPr>
+        <w:t>8. How do you verify that an image depicts the requested place and can be redistributed?</w:t>
+      </w:r>
+    </w:p>
+    <w:p>
+      <w:pPr>
+        <w:widowControl/>
+        <w:spacing w:after="160"/>
+      </w:pPr>
+      <w:r>
+        <w:rPr>
+          <w:color w:val="000000"/>
+        </w:rPr>
+        <w:t>These notes document implementation concepts. The student still needs to explain the new code and tradeoffs in their own words.</w:t>
+      </w:r>
+    </w:p>
+    <w:p>
+      <w:r>
+        <w:br w:type="page"/>
+      </w:r>
+    </w:p>
+    <w:p>
+      <w:pPr>
+        <w:pStyle w:val="Heading1"/>
+      </w:pPr>
+      <w:r>
+        <w:t>Momentum scrolling</w:t>
+      </w:r>
+    </w:p>
+    <w:p>
+      <w:pPr>
+        <w:widowControl/>
+        <w:spacing w:after="160"/>
+      </w:pPr>
+      <w:r>
+        <w:rPr>
+          <w:color w:val="000000"/>
+        </w:rPr>
+        <w:t>The user explicitly requested gradual deceleration after mouse-wheel input. This follow-up supersedes the earlier blanket rule against intercepting wheel events, while preserving native touch and fine trackpad movement.</w:t>
+      </w:r>
+    </w:p>
+    <w:p>
+      <w:pPr>
+        <w:pStyle w:val="Heading2"/>
+      </w:pPr>
+      <w:r>
+        <w:t>What it does and why</w:t>
+      </w:r>
+    </w:p>
+    <w:p>
+      <w:pPr>
+        <w:widowControl/>
+        <w:spacing w:after="160"/>
+      </w:pPr>
+      <w:r>
+        <w:rPr>
+          <w:color w:val="000000"/>
+        </w:rPr>
+        <w:t>Discrete vertical wheel steps update a desired scroll position. A requestAnimationFrame loop approaches that position quickly at first, then moves smaller distances until it stops. This creates a gentle stopping motion without changing the document layout or replacing browser scroll containers.</w:t>
+      </w:r>
+    </w:p>
+    <w:p>
+      <w:pPr>
+        <w:pStyle w:val="Heading2"/>
+      </w:pPr>
+      <w:r>
+        <w:t>Where and how</w:t>
+      </w:r>
+    </w:p>
+    <w:p>
+      <w:pPr>
+        <w:widowControl/>
+        <w:spacing w:after="160"/>
+      </w:pPr>
+      <w:r>
+        <w:rPr>
+          <w:color w:val="000000"/>
+        </w:rPr>
+        <w:t>client/src/useSoftScroll.js owns the behavior; the application shell mounts it per route. Each frame uses 1 - exp(-elapsed / 85) as its interpolation factor, so the damping responds to elapsed time rather than assuming a fixed frame rate. Queued travel is bounded; reversing the wheel discards the old target. Continuous positions are kept outside React state to avoid rerendering the interface every frame.</w:t>
+      </w:r>
+    </w:p>
+    <w:p>
+      <w:pPr>
+        <w:pStyle w:val="Heading2"/>
+      </w:pPr>
+      <w:r>
+        <w:t>Input and accessibility boundaries</w:t>
+      </w:r>
+    </w:p>
+    <w:p>
+      <w:pPr>
+        <w:widowControl/>
+        <w:spacing w:after="160"/>
+      </w:pPr>
+      <w:r>
+        <w:rPr>
+          <w:color w:val="000000"/>
+        </w:rPr>
+        <w:t>The nearest scrollable ancestor receives movement, preserving bounded result lists and dialog scrolling. Contained lists do not chain into the page at their edges. Fine pixel deltas, touch, keyboard input, horizontal gestures, browser zoom, form controls and map gestures keep their native behavior. Pointer/key input, route changes, visibility changes and reduced-motion preferences cancel the pending animation. The small-delta rule is an input heuristic, not a claim to identify hardware perfectly.</w:t>
+      </w:r>
+    </w:p>
+    <w:p>
+      <w:pPr>
+        <w:pStyle w:val="Heading2"/>
+      </w:pPr>
+      <w:r>
+        <w:t>How it was tested</w:t>
+      </w:r>
+    </w:p>
+    <w:p>
+      <w:pPr>
+        <w:widowControl/>
+        <w:spacing w:after="160"/>
+      </w:pPr>
+      <w:r>
+        <w:rPr>
+          <w:color w:val="000000"/>
+        </w:rPr>
+        <w:t>The real-browser check records frame positions after a wheel step and confirms a measurable decelerating tail. It verifies reversal, nested scrolling without page movement, contained boundaries, fine-delta/zoom/horizontal pass-through, reduced motion and a locked modal background. Lint and the client build also pass. No new dependency or external service was added.</w:t>
+      </w:r>
+    </w:p>
+    <w:p>
+      <w:pPr>
+        <w:pStyle w:val="Heading2"/>
+      </w:pPr>
+      <w:r>
+        <w:t>Interview explanation</w:t>
+      </w:r>
+    </w:p>
+    <w:p>
+      <w:pPr>
+        <w:widowControl/>
+        <w:spacing w:after="160"/>
+      </w:pPr>
+      <w:r>
+        <w:rPr>
+          <w:color w:val="000000"/>
+        </w:rPr>
+        <w:t>Smooth navigation and wheel momentum are different: CSS scroll-behavior affects deliberate scroll operations, while this feature eases discrete wheel input. The engineering work is preserving cancellation, scroll ownership and accessibility rather than adding animation everywhere.</w:t>
+      </w:r>
+    </w:p>
+    <w:p>
+      <w:pPr>
+        <w:widowControl/>
+        <w:spacing w:after="160"/>
+      </w:pPr>
+      <w:r>
+        <w:rPr>
+          <w:color w:val="000000"/>
+        </w:rPr>
+        <w:t>Questions: Why use elapsed-time damping instead of a fixed percentage per frame? Why keep frame values outside React state? How do you avoid a runaway scroll queue? What should immediately cancel the animation?</w:t>
       </w:r>
     </w:p>
     <w:sectPr>
@@ -1589,9 +2618,6 @@
     <w:rsid w:val="00FC693F"/>
     <w:pPr>
       <w:keepNext/>
-      <w:pBdr>
-        <w:bottom w:val="single" w:sz="8" w:space="4" w:color="4F81BD" w:themeColor="accent1"/>
-      </w:pBdr>
       <w:spacing w:after="300" w:line="240" w:lineRule="auto"/>
       <w:contextualSpacing/>
     </w:pPr>

</xml_diff>

<commit_message>
Changed UI layout to 3-tiered. Changed map functionality and overall look. Second UI overhaul
</commit_message>
<xml_diff>
--- a/docs/GlobeTrek-Learning-Journal.docx
+++ b/docs/GlobeTrek-Learning-Journal.docx
@@ -1892,6 +1892,601 @@
           <w:color w:val="000000"/>
         </w:rPr>
         <w:t>Questions: Why use elapsed-time damping instead of a fixed percentage per frame? Why keep frame values outside React state? How do you avoid a runaway scroll queue? What should immediately cancel the animation?</w:t>
+      </w:r>
+    </w:p>
+    <w:p>
+      <w:r>
+        <w:br w:type="page"/>
+      </w:r>
+    </w:p>
+    <w:p>
+      <w:pPr>
+        <w:pStyle w:val="Heading1"/>
+      </w:pPr>
+      <w:r>
+        <w:t>Atlas identity and discovery layout</w:t>
+      </w:r>
+    </w:p>
+    <w:p>
+      <w:pPr>
+        <w:pStyle w:val="Heading2"/>
+      </w:pPr>
+      <w:r>
+        <w:t>Semantic tokens and typography roles</w:t>
+      </w:r>
+    </w:p>
+    <w:p>
+      <w:pPr>
+        <w:widowControl/>
+        <w:spacing w:after="160"/>
+      </w:pPr>
+      <w:r>
+        <w:rPr>
+          <w:color w:val="000000"/>
+        </w:rPr>
+        <w:t>What: a shared palette assigns colours to purposes such as action, ink, surface and danger. Typography also has roles: Allura for the wordmark, Cormorant Garamond for editorial headings and Source Sans 3 for task data.</w:t>
+      </w:r>
+    </w:p>
+    <w:p>
+      <w:pPr>
+        <w:widowControl/>
+        <w:spacing w:after="160"/>
+      </w:pPr>
+      <w:r>
+        <w:rPr>
+          <w:color w:val="000000"/>
+        </w:rPr>
+        <w:t>Why: changing a brand should not require editing every component or weaken form readability. Dark mode changes the token values while keeping each component's meaning.</w:t>
+      </w:r>
+    </w:p>
+    <w:p>
+      <w:pPr>
+        <w:widowControl/>
+        <w:spacing w:after="160"/>
+      </w:pPr>
+      <w:r>
+        <w:rPr>
+          <w:color w:val="000000"/>
+        </w:rPr>
+        <w:t>Where: travel.css owns runtime tokens; main.jsx owns the shell variant; DESIGN.md mirrors those accepted choices. Fonts and their notices are local public assets.</w:t>
+      </w:r>
+    </w:p>
+    <w:p>
+      <w:pPr>
+        <w:widowControl/>
+        <w:spacing w:after="160"/>
+      </w:pPr>
+      <w:r>
+        <w:rPr>
+          <w:color w:val="000000"/>
+        </w:rPr>
+        <w:t>Testing: the atlas browser check exercises both themes and multiple widths; accessibility checks verify contrast and semantic controls. Font requests are deliberately failed to verify usable fallback navigation.</w:t>
+      </w:r>
+    </w:p>
+    <w:p>
+      <w:pPr>
+        <w:widowControl/>
+        <w:spacing w:after="160"/>
+      </w:pPr>
+      <w:r>
+        <w:rPr>
+          <w:color w:val="000000"/>
+        </w:rPr>
+        <w:t>Interview explanation: "I separated presentation roles from business behaviour. The redesign changed shared tokens and the discovery shell while the booking services and immutable reservation snapshots stayed unchanged."</w:t>
+      </w:r>
+    </w:p>
+    <w:p>
+      <w:pPr>
+        <w:pStyle w:val="Heading2"/>
+      </w:pPr>
+      <w:r>
+        <w:t>Centring an interactive canvas</w:t>
+      </w:r>
+    </w:p>
+    <w:p>
+      <w:pPr>
+        <w:widowControl/>
+        <w:spacing w:after="160"/>
+      </w:pPr>
+      <w:r>
+        <w:rPr>
+          <w:color w:val="000000"/>
+        </w:rPr>
+        <w:t>What: equal reserved widths on either side of the globe keep its midpoint aligned with the viewport. ResizeObserver supplies the actual host dimensions to the geographic renderer.</w:t>
+      </w:r>
+    </w:p>
+    <w:p>
+      <w:pPr>
+        <w:widowControl/>
+        <w:spacing w:after="160"/>
+      </w:pPr>
+      <w:r>
+        <w:rPr>
+          <w:color w:val="000000"/>
+        </w:rPr>
+        <w:t>Why: placing a globe in a flexible centre column does not guarantee viewport centring if the side panels have different widths. A CSS-sized canvas must also update its rendering dimensions after responsive changes.</w:t>
+      </w:r>
+    </w:p>
+    <w:p>
+      <w:pPr>
+        <w:widowControl/>
+        <w:spacing w:after="160"/>
+      </w:pPr>
+      <w:r>
+        <w:rPr>
+          <w:color w:val="000000"/>
+        </w:rPr>
+        <w:t>Where: atlas discovery layout in travel.css and the existing Globe.jsx interface. Theme changes update materials rather than remounting the renderer, preserving camera and selection.</w:t>
+      </w:r>
+    </w:p>
+    <w:p>
+      <w:pPr>
+        <w:widowControl/>
+        <w:spacing w:after="160"/>
+      </w:pPr>
+      <w:r>
+        <w:rPr>
+          <w:color w:val="000000"/>
+        </w:rPr>
+        <w:t>Testing: browser geometry checks compare globe midpoint with half the viewport width and canvas size with its container, alongside screenshot review. Country list selection remains available when rendering fails.</w:t>
+      </w:r>
+    </w:p>
+    <w:p>
+      <w:pPr>
+        <w:widowControl/>
+        <w:spacing w:after="160"/>
+      </w:pPr>
+      <w:r>
+        <w:rPr>
+          <w:color w:val="000000"/>
+        </w:rPr>
+        <w:t>Interview explanation: "I treat the globe as an optional interactive enhancement. Semantic country buttons and explicit navigation links provide the same discovery path without relying on WebGL, colour or pointer input."</w:t>
+      </w:r>
+    </w:p>
+    <w:p>
+      <w:r>
+        <w:br w:type="page"/>
+      </w:r>
+    </w:p>
+    <w:p>
+      <w:pPr>
+        <w:pStyle w:val="Heading1"/>
+      </w:pPr>
+      <w:r>
+        <w:t>Interactive geography and camera projection</w:t>
+      </w:r>
+    </w:p>
+    <w:p>
+      <w:pPr>
+        <w:widowControl/>
+        <w:spacing w:after="160"/>
+      </w:pPr>
+      <w:r>
+        <w:rPr>
+          <w:color w:val="000000"/>
+        </w:rPr>
+        <w:t>The current discovery contract replaces the earlier flat-country and preview-button behaviour. Country-list links open destination pages. Globe hover lifts a shape temporarily; clicking selects it and updates the preview. The explicit preview link opens its page.</w:t>
+      </w:r>
+    </w:p>
+    <w:p>
+      <w:pPr>
+        <w:pStyle w:val="Heading2"/>
+      </w:pPr>
+      <w:r>
+        <w:t>State and geographic hit testing</w:t>
+      </w:r>
+    </w:p>
+    <w:p>
+      <w:pPr>
+        <w:widowControl/>
+        <w:spacing w:after="160"/>
+      </w:pPr>
+      <w:r>
+        <w:rPr>
+          <w:color w:val="000000"/>
+        </w:rPr>
+        <w:t>What: selected and hovered country identifiers are separate state. Selected height takes precedence, so leaving a hover never clears a deliberate choice. Polygon heights use fractions of globe radius rather than screen pixels.</w:t>
+      </w:r>
+    </w:p>
+    <w:p>
+      <w:pPr>
+        <w:widowControl/>
+        <w:spacing w:after="160"/>
+      </w:pPr>
+      <w:r>
+        <w:rPr>
+          <w:color w:val="000000"/>
+        </w:rPr>
+        <w:t>Why: visual feedback should describe the user's action consistently across different screen sizes. Native links provide keyboard navigation and ordinary new-tab behaviour without JavaScript click emulation.</w:t>
+      </w:r>
+    </w:p>
+    <w:p>
+      <w:pPr>
+        <w:widowControl/>
+        <w:spacing w:after="160"/>
+      </w:pPr>
+      <w:r>
+        <w:rPr>
+          <w:color w:val="000000"/>
+        </w:rPr>
+        <w:t>Where: Globe.jsx owns selection feedback and pointer handling; globe-layout.js owns height, fit and collision calculations. A fast-tap fallback checks the sphere's geographic hit against supported Natural Earth polygons only when the renderer's normal click callback was missed. Movement beyond five pixels or pointer cancellation prevents that fallback from turning a drag into selection. Polygon holes and island groups are respected.</w:t>
+      </w:r>
+    </w:p>
+    <w:p>
+      <w:pPr>
+        <w:widowControl/>
+        <w:spacing w:after="160"/>
+      </w:pPr>
+      <w:r>
+        <w:rPr>
+          <w:color w:val="000000"/>
+        </w:rPr>
+        <w:t>How tested: unit cases cover height precedence, polygon holes, islands and open-ocean rejection; real-browser checks exercise hover entry/exit, polygon clicks, touch, oblique viewing and theme changes. Existing booking tests remain separate from these interaction checks.</w:t>
+      </w:r>
+    </w:p>
+    <w:p>
+      <w:pPr>
+        <w:widowControl/>
+        <w:spacing w:after="160"/>
+      </w:pPr>
+      <w:r>
+        <w:rPr>
+          <w:color w:val="000000"/>
+        </w:rPr>
+        <w:t>Interview explanation: "I modelled temporary hover independently from persistent selection. I also used links for navigation and kept canvas interaction as an enhancement, so exploration remains usable without WebGL."</w:t>
+      </w:r>
+    </w:p>
+    <w:p>
+      <w:pPr>
+        <w:pStyle w:val="Heading2"/>
+      </w:pPr>
+      <w:r>
+        <w:t>Fitting a sphere and projecting labels</w:t>
+      </w:r>
+    </w:p>
+    <w:p>
+      <w:pPr>
+        <w:widowControl/>
+        <w:spacing w:after="160"/>
+      </w:pPr>
+      <w:r>
+        <w:rPr>
+          <w:color w:val="000000"/>
+        </w:rPr>
+        <w:t>What: camera distance follows the sphere's tangent angle, camera field of view and viewport aspect ratio. The raised outer silhouette fits approximately ninety percent of the smaller available dimension. Country names project from geographic coordinates into HTML positions above the globe.</w:t>
+      </w:r>
+    </w:p>
+    <w:p>
+      <w:pPr>
+        <w:widowControl/>
+        <w:spacing w:after="160"/>
+      </w:pPr>
+      <w:r>
+        <w:rPr>
+          <w:color w:val="000000"/>
+        </w:rPr>
+        <w:t>Why: a fixed camera distance clips a globe in narrow or short containers. World coordinates must pass through the current camera matrices before they become reliable screen positions. OrbitControls can emit a change before the renderer updates those matrices.</w:t>
+      </w:r>
+    </w:p>
+    <w:p>
+      <w:pPr>
+        <w:widowControl/>
+        <w:spacing w:after="160"/>
+      </w:pPr>
+      <w:r>
+        <w:rPr>
+          <w:color w:val="000000"/>
+        </w:rPr>
+        <w:t>Where: fitGlobeAltitude uses elementary trigonometry; the projection effect updates camera matrices and schedules label position changes through requestAnimationFrame. Mutable DOM positions avoid React re-rendering for every camera frame. Rear-facing labels are hidden; collision placement prioritises selected and hovered names.</w:t>
+      </w:r>
+    </w:p>
+    <w:p>
+      <w:pPr>
+        <w:widowControl/>
+        <w:spacing w:after="160"/>
+      </w:pPr>
+      <w:r>
+        <w:rPr>
+          <w:color w:val="000000"/>
+        </w:rPr>
+        <w:t>How tested: unit cases verify the projected raised silhouette across portrait and landscape viewports and label priority under collisions. Browser checks measure responsive layout, exercise camera movement and verify that labels do not obstruct polygon input. Reduced motion removes hover and camera transitions.</w:t>
+      </w:r>
+    </w:p>
+    <w:p>
+      <w:pPr>
+        <w:widowControl/>
+        <w:spacing w:after="160"/>
+      </w:pPr>
+      <w:r>
+        <w:rPr>
+          <w:color w:val="000000"/>
+        </w:rPr>
+        <w:t>Interview explanation: "I separated layout sizing from camera projection. Fitting the raised sphere prevents clipping, while matrix updates keep labels and pointer targets aligned with the rendered geography."</w:t>
+      </w:r>
+    </w:p>
+    <w:p>
+      <w:r>
+        <w:br w:type="page"/>
+      </w:r>
+    </w:p>
+    <w:p>
+      <w:pPr>
+        <w:pStyle w:val="Heading1"/>
+      </w:pPr>
+      <w:r>
+        <w:t>Country relief workspace and read only pricing</w:t>
+      </w:r>
+    </w:p>
+    <w:p>
+      <w:pPr>
+        <w:widowControl/>
+        <w:spacing w:after="160"/>
+      </w:pPr>
+      <w:r>
+        <w:rPr>
+          <w:color w:val="000000"/>
+        </w:rPr>
+        <w:t>This chapter explains how GlobeTrek connects geographic discovery to its existing trip editor. The important separation is between a model used for interaction, a draft used for planning, an estimate used for comparison and a reservation used to consume inventory.</w:t>
+      </w:r>
+    </w:p>
+    <w:p>
+      <w:pPr>
+        <w:pStyle w:val="Heading2"/>
+      </w:pPr>
+      <w:r>
+        <w:t>Geographic coordinates and model transforms</w:t>
+      </w:r>
+    </w:p>
+    <w:p>
+      <w:pPr>
+        <w:widowControl/>
+        <w:spacing w:after="160"/>
+      </w:pPr>
+      <w:r>
+        <w:rPr>
+          <w:color w:val="000000"/>
+        </w:rPr>
+        <w:t>What it does: The importer converts longitude and latitude into regional coordinates, samples real elevation and triangulates country polygons. Labelled insets place distant regions beside the main country without changing the original coordinates.</w:t>
+      </w:r>
+    </w:p>
+    <w:p>
+      <w:pPr>
+        <w:widowControl/>
+        <w:spacing w:after="160"/>
+      </w:pPr>
+      <w:r>
+        <w:rPr>
+          <w:color w:val="000000"/>
+        </w:rPr>
+        <w:t>Why we chose it: Local GLB files provide bounded downloads and predictable rendering. The same regional projection and offset are used for terrain, pins and routes, preventing independent coordinate systems from drifting apart.</w:t>
+      </w:r>
+    </w:p>
+    <w:p>
+      <w:pPr>
+        <w:widowControl/>
+        <w:spacing w:after="160"/>
+      </w:pPr>
+      <w:r>
+        <w:rPr>
+          <w:color w:val="000000"/>
+        </w:rPr>
+        <w:t>Where it appears: scripts/build-relief.mjs, scripts/relief-config.mjs, client/src/geo/relief-layout.js and CountryModel.jsx. Source records and hashes are in the public relief manifest. Heights are exaggerated eight times; inset spacing is not travel distance.</w:t>
+      </w:r>
+    </w:p>
+    <w:p>
+      <w:pPr>
+        <w:widowControl/>
+        <w:spacing w:after="160"/>
+      </w:pPr>
+      <w:r>
+        <w:rPr>
+          <w:color w:val="000000"/>
+        </w:rPr>
+        <w:t>How we tested it: Asset validation checks all ten countries, twenty GLBs, budgets, hashes and 120 attraction anchors. Unit tests cover elevation interpolation, longitude wrapping, Hawaii selection and offshore coordinates. Browser checks exercise actual pins, overlapping selections and rendering failure.</w:t>
+      </w:r>
+    </w:p>
+    <w:p>
+      <w:pPr>
+        <w:widowControl/>
+        <w:spacing w:after="160"/>
+      </w:pPr>
+      <w:r>
+        <w:rPr>
+          <w:color w:val="000000"/>
+        </w:rPr>
+        <w:t>Interview explanation: A coordinate is domain data. A projection and inset transform are presentation data. Keeping that distinction lets us move Hawaii on screen without pretending its geographic location or distance has changed.</w:t>
+      </w:r>
+    </w:p>
+    <w:p>
+      <w:pPr>
+        <w:pStyle w:val="Heading2"/>
+      </w:pPr>
+      <w:r>
+        <w:t>Navigation and state lifetime</w:t>
+      </w:r>
+    </w:p>
+    <w:p>
+      <w:pPr>
+        <w:widowControl/>
+        <w:spacing w:after="160"/>
+      </w:pPr>
+      <w:r>
+        <w:rPr>
+          <w:color w:val="000000"/>
+        </w:rPr>
+        <w:t>What it does: Country entry coordinates single and double clicks, cancels obsolete transitions and keeps links usable with a keyboard or another tab. Explore and Plan live under one route; URL state identifies public filters, view, selected item and trip reference.</w:t>
+      </w:r>
+    </w:p>
+    <w:p>
+      <w:pPr>
+        <w:widowControl/>
+        <w:spacing w:after="160"/>
+      </w:pPr>
+      <w:r>
+        <w:rPr>
+          <w:color w:val="000000"/>
+        </w:rPr>
+        <w:t>Why we chose it: Planning state must outlive a presentation switch. Reusing the reducer and autosave system protects drafts while the renderer is replaced. Hidden geographic engines are unmounted to avoid paying for two WebGL render loops.</w:t>
+      </w:r>
+    </w:p>
+    <w:p>
+      <w:pPr>
+        <w:widowControl/>
+        <w:spacing w:after="160"/>
+      </w:pPr>
+      <w:r>
+        <w:rPr>
+          <w:color w:val="000000"/>
+        </w:rPr>
+        <w:t>Where it appears: Discovery, Globe, CountryWorkspace, CountryCatalog and the embedded TripEditor. Compatibility entries preserve older planner, product and hotel links. Guest replacement uses the shared confirmation dialog.</w:t>
+      </w:r>
+    </w:p>
+    <w:p>
+      <w:pPr>
+        <w:widowControl/>
+        <w:spacing w:after="160"/>
+      </w:pPr>
+      <w:r>
+        <w:rPr>
+          <w:color w:val="000000"/>
+        </w:rPr>
+        <w:t>How we tested it: Browser journeys cover marker selection, details and Back, inline trip creation, mode switches, guest recovery and the existing authentication/save/reservation flow. Tests retain revision conflicts and booking ownership checks.</w:t>
+      </w:r>
+    </w:p>
+    <w:p>
+      <w:pPr>
+        <w:widowControl/>
+        <w:spacing w:after="160"/>
+      </w:pPr>
+      <w:r>
+        <w:rPr>
+          <w:color w:val="000000"/>
+        </w:rPr>
+        <w:t>Interview explanation: The URL owns shareable navigation, the editor owns mutable draft state and the renderer owns disposable graphics resources. These lifetimes are deliberately different. A view change should not recreate the user's work.</w:t>
+      </w:r>
+    </w:p>
+    <w:p>
+      <w:pPr>
+        <w:pStyle w:val="Heading2"/>
+      </w:pPr>
+      <w:r>
+        <w:t>Read only estimates and final quotes</w:t>
+      </w:r>
+    </w:p>
+    <w:p>
+      <w:pPr>
+        <w:widowControl/>
+        <w:spacing w:after="160"/>
+      </w:pPr>
+      <w:r>
+        <w:rPr>
+          <w:color w:val="000000"/>
+        </w:rPr>
+        <w:t>What it does: A bounded server endpoint calculates unit prices and estimated party totals without reserving stock. Saved-trip summaries use the same service. Stays use nights times enough rooms for the party; tours use one seat per traveler. Packages resolve fixed components.</w:t>
+      </w:r>
+    </w:p>
+    <w:p>
+      <w:pPr>
+        <w:widowControl/>
+        <w:spacing w:after="160"/>
+      </w:pPr>
+      <w:r>
+        <w:rPr>
+          <w:color w:val="000000"/>
+        </w:rPr>
+        <w:t>Why we chose it: React should display prices, not invent a parallel package or fee calculation. Shared server arithmetic keeps estimates aligned with checkout while preserving the quote and hold lifecycle. An independent rate limiter prevents browsing estimates from exhausting booking attempts.</w:t>
+      </w:r>
+    </w:p>
+    <w:p>
+      <w:pPr>
+        <w:widowControl/>
+        <w:spacing w:after="160"/>
+      </w:pPr>
+      <w:r>
+        <w:rPr>
+          <w:color w:val="000000"/>
+        </w:rPr>
+        <w:t>Where it appears: server/src/services/estimates.js and travel-policy.js, POST /api/estimates, POST /api/estimates/trip and client/src/pricing.jsx. Native currency is authoritative; optional INR values carry their reference date. Attraction tickets are not sold, and free template copying does not mean free travel.</w:t>
+      </w:r>
+    </w:p>
+    <w:p>
+      <w:pPr>
+        <w:widowControl/>
+        <w:spacing w:after="160"/>
+      </w:pPr>
+      <w:r>
+        <w:rPr>
+          <w:color w:val="000000"/>
+        </w:rPr>
+        <w:t>How we tested it: Integration tests compare stays and packages with actual server quotes, inspect inventory before and after estimation, check missing dates and invalid batches, preserve legitimate zero JPY values and verify saved-trip isolation. Query identities include relevant selections so stale results cannot replace current estimates.</w:t>
+      </w:r>
+    </w:p>
+    <w:p>
+      <w:pPr>
+        <w:widowControl/>
+        <w:spacing w:after="160"/>
+      </w:pPr>
+      <w:r>
+        <w:rPr>
+          <w:color w:val="000000"/>
+        </w:rPr>
+        <w:t>Interview explanation: An estimate answers what a selection would cost under stated assumptions. A quote snapshots current validated terms. A hold consumes capacity transactionally. Combining these responsibilities would make ordinary browsing compete for inventory.</w:t>
+      </w:r>
+    </w:p>
+    <w:p>
+      <w:pPr>
+        <w:pStyle w:val="Heading2"/>
+      </w:pPr>
+      <w:r>
+        <w:t>Interview follow up questions</w:t>
+      </w:r>
+    </w:p>
+    <w:p>
+      <w:pPr>
+        <w:widowControl/>
+        <w:spacing w:after="160"/>
+      </w:pPr>
+      <w:r>
+        <w:rPr>
+          <w:color w:val="000000"/>
+        </w:rPr>
+        <w:t>Why not fetch terrain continuously? Offline processing makes source provenance, mobile detail and download budgets reviewable; the browser renders local bounded assets.</w:t>
+      </w:r>
+    </w:p>
+    <w:p>
+      <w:pPr>
+        <w:widowControl/>
+        <w:spacing w:after="160"/>
+      </w:pPr>
+      <w:r>
+        <w:rPr>
+          <w:color w:val="000000"/>
+        </w:rPr>
+        <w:t>Why are pins not moved inland? That would change the meaning of the place. Offshore coordinates are preserved even when sampled terrain is at sea level.</w:t>
+      </w:r>
+    </w:p>
+    <w:p>
+      <w:pPr>
+        <w:widowControl/>
+        <w:spacing w:after="160"/>
+      </w:pPr>
+      <w:r>
+        <w:rPr>
+          <w:color w:val="000000"/>
+        </w:rPr>
+        <w:t>Why keep zero and missing prices different? Zero is a legitimate numeric value; missing is an unresolved selection or unavailable data. Truthiness would hide valid zero values and could encourage misleading fallback totals.</w:t>
+      </w:r>
+    </w:p>
+    <w:p>
+      <w:pPr>
+        <w:widowControl/>
+        <w:spacing w:after="160"/>
+      </w:pPr>
+      <w:r>
+        <w:rPr>
+          <w:color w:val="000000"/>
+        </w:rPr>
+        <w:t>Why does an estimate not promise availability? Another transaction can consume shared room or tour inventory after estimation. Only the transactional hold conditionally reserves all selected resources together.</w:t>
       </w:r>
     </w:p>
     <w:sectPr>

</xml_diff>

<commit_message>
Updated home page UI: Re-structred inner UI and map detailing: Login feature and deployement pending
</commit_message>
<xml_diff>
--- a/docs/GlobeTrek-Learning-Journal.docx
+++ b/docs/GlobeTrek-Learning-Journal.docx
@@ -2487,6 +2487,104 @@
           <w:color w:val="000000"/>
         </w:rPr>
         <w:t>Why does an estimate not promise availability? Another transaction can consume shared room or tour inventory after estimation. Only the transactional hold conditionally reserves all selected resources together.</w:t>
+      </w:r>
+    </w:p>
+    <w:p>
+      <w:r>
+        <w:br w:type="page"/>
+      </w:r>
+    </w:p>
+    <w:p>
+      <w:pPr>
+        <w:pStyle w:val="Heading1"/>
+      </w:pPr>
+      <w:r>
+        <w:t>Fluid atlas layouts and contextual islands</w:t>
+      </w:r>
+    </w:p>
+    <w:p>
+      <w:pPr>
+        <w:pStyle w:val="Heading2"/>
+      </w:pPr>
+      <w:r>
+        <w:t>Presentation state is not domain state</w:t>
+      </w:r>
+    </w:p>
+    <w:p>
+      <w:pPr>
+        <w:widowControl/>
+        <w:spacing w:after="160"/>
+      </w:pPr>
+      <w:r>
+        <w:t>What: a shell-level registry displays a route-owned contextual island. Why: the destination, trip reducer, pricing query and reservation response remain their existing sources of truth. Where: atlas-presentation.jsx and the route-level IslandContent publishers. Verification: the complete guest, sign-in, save, hold, confirmation and cancellation browser journey passed, as did all 81 automated tests. Interview explanation: I reused business state and actions instead of creating a second booking or draft model for an animated widget.</w:t>
+      </w:r>
+    </w:p>
+    <w:p>
+      <w:pPr>
+        <w:pStyle w:val="Heading2"/>
+      </w:pPr>
+      <w:r>
+        <w:t>Motion follows meaning</w:t>
+      </w:r>
+    </w:p>
+    <w:p>
+      <w:pPr>
+        <w:widowControl/>
+        <w:spacing w:after="160"/>
+      </w:pPr>
+      <w:r>
+        <w:t>What: finite title, page, panel, tab and island transitions use Motion 14.9.0. Why: the movement explains entry, selection and expansion. Where: the shared presentation primitives and existing destination reveal. Verification: keyboard, reduced-motion and seven-width browser checks. Interview explanation: navigation never waits for animation completion, outgoing interactive pages are not retained, and only one geographic engine is mounted.</w:t>
+      </w:r>
+    </w:p>
+    <w:p>
+      <w:pPr>
+        <w:pStyle w:val="Heading2"/>
+      </w:pPr>
+      <w:r>
+        <w:t>Responsive panels and focus</w:t>
+      </w:r>
+    </w:p>
+    <w:p>
+      <w:pPr>
+        <w:widowControl/>
+        <w:spacing w:after="160"/>
+      </w:pPr>
+      <w:r>
+        <w:t>What: wide screens reserve equal side tracks; smaller screens open panels through Radix dialogs. Why: the geography keeps its space while the collection stays accessible. Desktop collapsed content stays mounted and inert; session preferences, draft state and scroll restoration are separate concerns. Verification caught an old mobile rule hiding new setup panels and a tablet breakpoint mismatch; both were corrected. Preview dialogs close an existing collection sheet rather than layering inaccessible actions behind it.</w:t>
+      </w:r>
+    </w:p>
+    <w:p>
+      <w:pPr>
+        <w:pStyle w:val="Heading2"/>
+      </w:pPr>
+      <w:r>
+        <w:t>Accessibility during animation</w:t>
+      </w:r>
+    </w:p>
+    <w:p>
+      <w:pPr>
+        <w:widowControl/>
+        <w:spacing w:after="160"/>
+      </w:pPr>
+      <w:r>
+        <w:t>What: reduced motion removes displacement and staggering; keyboard controls have labelled expansion and focus restoration. Why: animation is optional, and intermediate frames must stay readable. A browser accessibility check found that simultaneously interpolating foreground and background tab colours produced low contrast. The fix makes those colours immediate while retaining the moving tab indicator. Interview explanation: testing only the settled screenshot would miss an accessibility regression during a transition.</w:t>
+      </w:r>
+    </w:p>
+    <w:p>
+      <w:pPr>
+        <w:pStyle w:val="Heading2"/>
+      </w:pPr>
+      <w:r>
+        <w:t>Performance and honest progress</w:t>
+      </w:r>
+    </w:p>
+    <w:p>
+      <w:pPr>
+        <w:widowControl/>
+        <w:spacing w:after="160"/>
+      </w:pPr>
+      <w:r>
+        <w:t>What: country-list progress measures actual scrollTop over scrollable height. It is not loading or booking progress. Geographic engines remain lazy and idle rendering remains on demand. Adding Motion at the shared shell moves its code into the initial entry bundle; this has a measurable loading cost. Verification records bundle sizes and unthrottled local timings, not mobile hardware FPS or hosted scalability. Interview explanation: I check both visual smoothness and the cost of delivering the animation code.</w:t>
       </w:r>
     </w:p>
     <w:sectPr>

</xml_diff>